<commit_message>
updated week 9 log
</commit_message>
<xml_diff>
--- a/Weekly Logs/Matt/Matt Baker - Week 9 Individual Logbook.docx
+++ b/Weekly Logs/Matt/Matt Baker - Week 9 Individual Logbook.docx
@@ -1274,21 +1274,7 @@
                 <w:rStyle w:val="Hyperlink"/>
                 <w:noProof/>
               </w:rPr>
-              <w:t>Resea</w:t>
-            </w:r>
-            <w:r>
-              <w:rPr>
-                <w:rStyle w:val="Hyperlink"/>
-                <w:noProof/>
-              </w:rPr>
-              <w:t>r</w:t>
-            </w:r>
-            <w:r>
-              <w:rPr>
-                <w:rStyle w:val="Hyperlink"/>
-                <w:noProof/>
-              </w:rPr>
-              <w:t>ch</w:t>
+              <w:t>Research</w:t>
             </w:r>
             <w:r>
               <w:rPr>
@@ -1879,7 +1865,19 @@
               <w:rPr>
                 <w:sz w:val="24"/>
               </w:rPr>
-              <w:t>6hrs</w:t>
+              <w:t>8</w:t>
+            </w:r>
+            <w:r>
+              <w:rPr>
+                <w:sz w:val="24"/>
+              </w:rPr>
+              <w:t>hrs</w:t>
+            </w:r>
+            <w:r>
+              <w:rPr>
+                <w:sz w:val="24"/>
+              </w:rPr>
+              <w:t xml:space="preserve"> 45 min</w:t>
             </w:r>
           </w:p>
         </w:tc>
@@ -2429,10 +2427,10 @@
               <w:ind w:left="0" w:firstLine="0"/>
             </w:pPr>
             <w:r>
-              <w:t>3</w:t>
-            </w:r>
-            <w:r>
-              <w:t>8</w:t>
+              <w:t>40</w:t>
+            </w:r>
+            <w:r>
+              <w:t>hrs 45min</w:t>
             </w:r>
           </w:p>
         </w:tc>
@@ -2509,19 +2507,13 @@
               <w:rPr>
                 <w:sz w:val="24"/>
               </w:rPr>
-              <w:t>212</w:t>
+              <w:t>21</w:t>
             </w:r>
             <w:r>
               <w:rPr>
                 <w:sz w:val="24"/>
               </w:rPr>
-              <w:t>hrs</w:t>
-            </w:r>
-            <w:r>
-              <w:rPr>
-                <w:sz w:val="24"/>
-              </w:rPr>
-              <w:t xml:space="preserve"> 15 min</w:t>
+              <w:t>5</w:t>
             </w:r>
             <w:r>
               <w:rPr>
@@ -2640,7 +2632,13 @@
     </w:p>
     <w:p>
       <w:r>
-        <w:t>10:00 – 2:30PM (2hrs 30mins)</w:t>
+        <w:t>10:00 – 2:30PM (</w:t>
+      </w:r>
+      <w:r>
+        <w:t>4</w:t>
+      </w:r>
+      <w:r>
+        <w:t>hrs 30mins)</w:t>
       </w:r>
     </w:p>
     <w:p>
@@ -2668,6 +2666,9 @@
       <w:r>
         <w:t xml:space="preserve"> I read out and discussed slide by slide the mid project presentation descriptor and Q&amp;A document.</w:t>
       </w:r>
+      <w:r>
+        <w:t xml:space="preserve"> I talk about my progress with the Foremost script.</w:t>
+      </w:r>
     </w:p>
     <w:p>
       <w:r>
@@ -2714,6 +2715,17 @@
         <w:t>and making decisions regarding the presentation, I relay the important features that should be expected in the presentation, especially the change in general philosophy of the project, the conciseness and the opportunities for Geoff to ask questions were topics I mentioned.</w:t>
       </w:r>
     </w:p>
+    <w:p>
+      <w:r>
+        <w:t>Thursday 4:15 – 5:00pm (45mins)</w:t>
+      </w:r>
+    </w:p>
+    <w:p>
+      <w:r>
+        <w:t>Reviewing Sam’s PowerPoint with him, discussing required changes, who might deliver what sections.</w:t>
+      </w:r>
+    </w:p>
+    <w:p/>
     <w:p>
       <w:pPr>
         <w:rPr>
@@ -2827,6 +2839,7 @@
     </w:p>
     <w:p>
       <w:r>
+        <w:lastRenderedPageBreak/>
         <w:t>10AM-12PM</w:t>
       </w:r>
       <w:r>
@@ -2844,7 +2857,6 @@
       </w:pPr>
       <w:bookmarkStart w:id="5" w:name="_Toc240221606"/>
       <w:r>
-        <w:lastRenderedPageBreak/>
         <w:t>Research</w:t>
       </w:r>
       <w:bookmarkEnd w:id="5"/>

</xml_diff>